<commit_message>
feat: Implementar Fase 1 y 2 (pytest suite, Pydantic v2 ConfigDict, seguridad auth y README)
</commit_message>
<xml_diff>
--- a/backend/Plantillas/espTec.docx
+++ b/backend/Plantillas/espTec.docx
@@ -11,8 +11,8 @@
           <w:szCs w:val="24"/>
         </w:rPr>
       </w:pPr>
-      <w:bookmarkStart w:id="0" w:name="_Hlk182578113"/>
-      <w:bookmarkStart w:id="1" w:name="_Hlk180486700"/>
+      <w:bookmarkStart w:id="0" w:name="_Hlk180486700"/>
+      <w:bookmarkStart w:id="1" w:name="_Hlk182578113"/>
       <w:r>
         <w:rPr>
           <w:rFonts w:ascii="Century" w:hAnsi="Century" w:cs="Times New Roman"/>
@@ -209,6 +209,7 @@
               </w:rPr>
             </w:pPr>
             <w:bookmarkStart w:id="4" w:name="_Hlk132644364"/>
+            <w:proofErr w:type="spellStart"/>
             <w:r>
               <w:rPr>
                 <w:rFonts w:ascii="Century" w:eastAsia="Times New Roman" w:hAnsi="Century" w:cs="Times New Roman"/>
@@ -221,6 +222,7 @@
               </w:rPr>
               <w:t>Nº</w:t>
             </w:r>
+            <w:proofErr w:type="spellEnd"/>
           </w:p>
         </w:tc>
         <w:tc>
@@ -640,6 +642,7 @@
                 <w:lang w:eastAsia="es-BO"/>
               </w:rPr>
             </w:pPr>
+            <w:proofErr w:type="spellStart"/>
             <w:r>
               <w:rPr>
                 <w:rFonts w:ascii="Century" w:eastAsia="Times New Roman" w:hAnsi="Century" w:cs="Times New Roman"/>
@@ -650,6 +653,7 @@
               </w:rPr>
               <w:t>cant</w:t>
             </w:r>
+            <w:proofErr w:type="spellEnd"/>
           </w:p>
         </w:tc>
         <w:tc>
@@ -677,6 +681,7 @@
                 <w:lang w:eastAsia="es-BO"/>
               </w:rPr>
             </w:pPr>
+            <w:proofErr w:type="spellStart"/>
             <w:r>
               <w:rPr>
                 <w:rFonts w:ascii="Century" w:eastAsia="Times New Roman" w:hAnsi="Century" w:cs="Times New Roman"/>
@@ -687,6 +692,7 @@
               </w:rPr>
               <w:t>pu</w:t>
             </w:r>
+            <w:proofErr w:type="spellEnd"/>
           </w:p>
         </w:tc>
         <w:tc>
@@ -755,6 +761,7 @@
                 <w:lang w:eastAsia="es-BO"/>
               </w:rPr>
             </w:pPr>
+            <w:proofErr w:type="gramStart"/>
             <w:r>
               <w:rPr>
                 <w:rFonts w:ascii="Century" w:eastAsia="Times New Roman" w:hAnsi="Century" w:cs="Times New Roman"/>
@@ -765,6 +772,7 @@
               </w:rPr>
               <w:t>TOTAL</w:t>
             </w:r>
+            <w:proofErr w:type="gramEnd"/>
             <w:r>
               <w:rPr>
                 <w:rFonts w:ascii="Century" w:eastAsia="Times New Roman" w:hAnsi="Century" w:cs="Times New Roman"/>
@@ -815,7 +823,7 @@
           </w:p>
         </w:tc>
       </w:tr>
-      <w:bookmarkEnd w:id="1"/>
+      <w:bookmarkEnd w:id="0"/>
       <w:bookmarkEnd w:id="4"/>
     </w:tbl>
     <w:p>
@@ -834,7 +842,7 @@
         </w:rPr>
       </w:pPr>
     </w:p>
-    <w:bookmarkEnd w:id="0"/>
+    <w:bookmarkEnd w:id="1"/>
     <w:p>
       <w:pPr>
         <w:pStyle w:val="Prrafodelista"/>
@@ -1134,7 +1142,90 @@
           <w:ilvl w:val="0"/>
           <w:numId w:val="17"/>
         </w:numPr>
+        <w:spacing w:after="160" w:line="240" w:lineRule="auto"/>
+        <w:rPr>
+          <w:rFonts w:ascii="Century" w:hAnsi="Century" w:cs="Times New Roman"/>
+          <w:b/>
+          <w:bCs/>
+        </w:rPr>
+      </w:pPr>
+      <w:r>
+        <w:rPr>
+          <w:rFonts w:ascii="Century" w:hAnsi="Century"/>
+          <w:b/>
+          <w:bCs/>
+        </w:rPr>
+        <w:t>Plazo de entrega</w:t>
+      </w:r>
+    </w:p>
+    <w:p>
+      <w:pPr>
         <w:spacing w:line="240" w:lineRule="auto"/>
+        <w:ind w:left="709"/>
+        <w:jc w:val="both"/>
+        <w:rPr>
+          <w:rFonts w:ascii="Century" w:eastAsia="Times New Roman" w:hAnsi="Century" w:cs="Times New Roman"/>
+          <w:color w:val="000000"/>
+          <w:lang w:eastAsia="es-BO"/>
+        </w:rPr>
+      </w:pPr>
+      <w:r>
+        <w:rPr>
+          <w:rFonts w:ascii="Century" w:hAnsi="Century"/>
+        </w:rPr>
+        <w:t>{PLAZOENTREGA}</w:t>
+      </w:r>
+    </w:p>
+    <w:p>
+      <w:pPr>
+        <w:pStyle w:val="Prrafodelista"/>
+        <w:numPr>
+          <w:ilvl w:val="0"/>
+          <w:numId w:val="17"/>
+        </w:numPr>
+        <w:spacing w:after="160" w:line="240" w:lineRule="auto"/>
+        <w:rPr>
+          <w:rFonts w:ascii="Century" w:hAnsi="Century" w:cs="Times New Roman"/>
+          <w:b/>
+          <w:bCs/>
+        </w:rPr>
+      </w:pPr>
+      <w:r>
+        <w:rPr>
+          <w:rFonts w:ascii="Century" w:hAnsi="Century"/>
+          <w:b/>
+          <w:bCs/>
+        </w:rPr>
+        <w:t>Forma de pago</w:t>
+      </w:r>
+    </w:p>
+    <w:p>
+      <w:pPr>
+        <w:spacing w:line="240" w:lineRule="auto"/>
+        <w:ind w:left="709"/>
+        <w:jc w:val="both"/>
+        <w:rPr>
+          <w:rFonts w:ascii="Century" w:eastAsia="Times New Roman" w:hAnsi="Century" w:cs="Times New Roman"/>
+          <w:color w:val="000000"/>
+          <w:lang w:eastAsia="es-BO"/>
+        </w:rPr>
+      </w:pPr>
+      <w:r>
+        <w:rPr>
+          <w:rFonts w:ascii="Century" w:hAnsi="Century"/>
+        </w:rPr>
+        <w:t>{FORMAPAGO}</w:t>
+      </w:r>
+    </w:p>
+    <w:p>
+      <w:pPr>
+        <w:pStyle w:val="Prrafodelista"/>
+        <w:numPr>
+          <w:ilvl w:val="0"/>
+          <w:numId w:val="17"/>
+        </w:numPr>
+        <w:spacing w:line="240" w:lineRule="auto"/>
+        <w:contextualSpacing w:val="0"/>
         <w:jc w:val="both"/>
         <w:rPr>
           <w:rFonts w:ascii="Century" w:eastAsia="Times New Roman" w:hAnsi="Century" w:cs="Times New Roman"/>
@@ -1642,8 +1733,18 @@
         <w:color w:val="244061" w:themeColor="accent1" w:themeShade="80"/>
         <w:sz w:val="28"/>
       </w:rPr>
-      <w:t>Provincia Pacajes</w:t>
+      <w:t xml:space="preserve">Provincia </w:t>
     </w:r>
+    <w:proofErr w:type="spellStart"/>
+    <w:r>
+      <w:rPr>
+        <w:rFonts w:ascii="Adobe Garamond Pro" w:hAnsi="Adobe Garamond Pro"/>
+        <w:color w:val="244061" w:themeColor="accent1" w:themeShade="80"/>
+        <w:sz w:val="28"/>
+      </w:rPr>
+      <w:t>Pacajes</w:t>
+    </w:r>
+    <w:proofErr w:type="spellEnd"/>
   </w:p>
   <w:p>
     <w:pPr>

</xml_diff>